<commit_message>
Regenerate docx with corrected references and in-text citations
Co-Authored-By: Tatsuki Onishi <bougtoir@gmail.com>
</commit_message>
<xml_diff>
--- a/results/manuscript/IONE_manuscript_revised.docx
+++ b/results/manuscript/IONE_manuscript_revised.docx
@@ -5000,6 +5000,14 @@
         <w:pStyle w:val="FirstParagraph"/>
       </w:pPr>
       <w:r>
+        <w:t xml:space="preserve">Table 4 shows the eta-squared (η²) values for each critical variable under strong Z→X influence.</w:t>
+      </w:r>
+    </w:p>
+    <w:p>
+      <w:pPr>
+        <w:pStyle w:val="BodyText"/>
+      </w:pPr>
+      <w:r>
         <w:rPr>
           <w:b/>
         </w:rPr>
@@ -5718,6 +5726,14 @@
         <w:pStyle w:val="FirstParagraph"/>
       </w:pPr>
       <w:r>
+        <w:t xml:space="preserve">Table 5 presents C1 and W values by method. Figures 1–4 visualise the key patterns.</w:t>
+      </w:r>
+    </w:p>
+    <w:p>
+      <w:pPr>
+        <w:pStyle w:val="BodyText"/>
+      </w:pPr>
+      <w:r>
         <w:rPr>
           <w:b/>
         </w:rPr>
@@ -6421,6 +6437,14 @@
     <w:p>
       <w:pPr>
         <w:pStyle w:val="FirstParagraph"/>
+      </w:pPr>
+      <w:r>
+        <w:t xml:space="preserve">Table 6 reports treatment effect bias metrics.</w:t>
+      </w:r>
+    </w:p>
+    <w:p>
+      <w:pPr>
+        <w:pStyle w:val="BodyText"/>
       </w:pPr>
       <w:r>
         <w:rPr>
@@ -10576,7 +10600,7 @@
         <w:t xml:space="preserve">Stat Med</w:t>
       </w:r>
       <w:r>
-        <w:t xml:space="preserve">. 2020;39(29):4349–69.</w:t>
+        <w:t xml:space="preserve">. 2020;39(30):4821–40.</w:t>
       </w:r>
     </w:p>
     <w:p>
@@ -10684,7 +10708,7 @@
         <w:pStyle w:val="Compact"/>
       </w:pPr>
       <w:r>
-        <w:t xml:space="preserve">Wyss R, Schneeweiss S, van der Laan M, Lendle SD, Ju C, Franklin JM. Machine learning for improving high-dimensional proxy confounder adjustment in healthcare database studies.</w:t>
+        <w:t xml:space="preserve">Wyss R, Schneeweiss S, van der Laan M, Lendle SD, Ju C, Franklin JM. Using Super Learner prediction modeling to improve high-dimensional propensity score estimation.</w:t>
       </w:r>
       <w:r>
         <w:t xml:space="preserve"> </w:t>
@@ -10693,10 +10717,10 @@
         <w:rPr>
           <w:i/>
         </w:rPr>
-        <w:t xml:space="preserve">Stat Med</w:t>
-      </w:r>
-      <w:r>
-        <w:t xml:space="preserve">. 2018;37(8):1310–24.</w:t>
+        <w:t xml:space="preserve">Epidemiology</w:t>
+      </w:r>
+      <w:r>
+        <w:t xml:space="preserve">. 2018;29(1):96–106.</w:t>
       </w:r>
     </w:p>
     <w:p>

</xml_diff>

<commit_message>
Regenerate docx after removing ref [21]
Co-Authored-By: Tatsuki Onishi <bougtoir@gmail.com>
</commit_message>
<xml_diff>
--- a/results/manuscript/IONE_manuscript_revised.docx
+++ b/results/manuscript/IONE_manuscript_revised.docx
@@ -281,7 +281,7 @@
         <w:pStyle w:val="BodyText"/>
       </w:pPr>
       <w:r>
-        <w:t xml:space="preserve">The concept that measured variables may carry indirect information about unmeasured confounders is not new. The hdPS algorithm rests on the insight that a sufficiently large collection of proxy variables can collectively approximate the influence of unmeasured confounders [19]. Proximal causal inference formalises the use of proxy variables for identification of causal effects in the presence of unmeasured confounding [22]. Latent class analysis and finite mixture models seek to identify unobserved subgroups from patterns in observed variables [23]. However, none of these approaches explicitly addresses the problem of</w:t>
+        <w:t xml:space="preserve">The concept that measured variables may carry indirect information about unmeasured confounders is not new. The hdPS algorithm rests on the insight that a sufficiently large collection of proxy variables can collectively approximate the influence of unmeasured confounders [19]. Proximal causal inference formalises the use of proxy variables for identification of causal effects in the presence of unmeasured confounding [21]. Latent class analysis and finite mixture models seek to identify unobserved subgroups from patterns in observed variables [22]. However, none of these approaches explicitly addresses the problem of</w:t>
       </w:r>
       <w:r>
         <w:t xml:space="preserve"> </w:t>
@@ -293,7 +293,7 @@
         <w:t xml:space="preserve">population incoherence</w:t>
       </w:r>
       <w:r>
-        <w:t xml:space="preserve">—the condition in which an apparently homogeneous study population actually comprises multiple coherent subpopulations with heterogeneous treatment effects. In current practice, the homogeneity of study populations is typically assumed implicitly, with baseline characteristics tables (Table 1) providing only descriptive summaries that cannot formally test for hidden subgroup structure [24].</w:t>
+        <w:t xml:space="preserve">—the condition in which an apparently homogeneous study population actually comprises multiple coherent subpopulations with heterogeneous treatment effects. In current practice, the homogeneity of study populations is typically assumed implicitly, with baseline characteristics tables (Table 1) providing only descriptive summaries that cannot formally test for hidden subgroup structure [23].</w:t>
       </w:r>
     </w:p>
     <w:p>
@@ -339,7 +339,7 @@
         <w:pStyle w:val="BodyText"/>
       </w:pPr>
       <w:r>
-        <w:t xml:space="preserve">To operationalise this approach, we develop two families of stratification methods. The first family (decision power-based methods) exploits the relationship between measured variables and the outcome: because unmeasured effect modifiers influence both measured covariates and the treatment effect, residual patterns from outcome prediction models may reflect the unmeasured variable’s structure. To mitigate overfitting, outcome-informed methods employ sample splitting (training on one half of the data, assigning strata on the full dataset). The second family (feature score-based methods) operates in the covariate space alone, using unsupervised techniques such as principal component analysis and clustering to identify multivariate patterns attributable to unmeasured variables, without reference to the outcome. As diagnostic indicators, we propose two complementary metrics: C1, a between-stratum heterogeneity indicator derived from the I² statistic [25] applied to stratum-specific treatment effects (log odds ratios), and W, a within-stratum homogeneity indicator quantifying how much residual treatment effect heterogeneity remains within each stratum after stratification. C1 near 0 indicates strong between-stratum heterogeneity (evidence of population incoherence); W near 1 indicates that within-stratum effects are homogeneous (successful extraction of coherent subpopulations). It is important to note that between-stratum heterogeneity (measured by C1) and within-stratum homogeneity (measured by W) are related but conceptually distinct: strata that differ from one another do not necessarily have homogeneous effects within each stratum.</w:t>
+        <w:t xml:space="preserve">To operationalise this approach, we develop two families of stratification methods. The first family (decision power-based methods) exploits the relationship between measured variables and the outcome: because unmeasured effect modifiers influence both measured covariates and the treatment effect, residual patterns from outcome prediction models may reflect the unmeasured variable’s structure. To mitigate overfitting, outcome-informed methods employ sample splitting (training on one half of the data, assigning strata on the full dataset). The second family (feature score-based methods) operates in the covariate space alone, using unsupervised techniques such as principal component analysis and clustering to identify multivariate patterns attributable to unmeasured variables, without reference to the outcome. As diagnostic indicators, we propose two complementary metrics: C1, a between-stratum heterogeneity indicator derived from the I² statistic [24] applied to stratum-specific treatment effects (log odds ratios), and W, a within-stratum homogeneity indicator quantifying how much residual treatment effect heterogeneity remains within each stratum after stratification. C1 near 0 indicates strong between-stratum heterogeneity (evidence of population incoherence); W near 1 indicates that within-stratum effects are homogeneous (successful extraction of coherent subpopulations). It is important to note that between-stratum heterogeneity (measured by C1) and within-stratum homogeneity (measured by W) are related but conceptually distinct: strata that differ from one another do not necessarily have homogeneous effects within each stratum.</w:t>
       </w:r>
     </w:p>
     <w:p>
@@ -372,7 +372,7 @@
         <w:pStyle w:val="FirstParagraph"/>
       </w:pPr>
       <w:r>
-        <w:t xml:space="preserve">This simulation study is reported following the ADEMP framework (Aims, Data-generating mechanisms, Estimands, Methods, Performance measures) as recommended by Morris, White, and Crowther [26]. All analyses were conducted in Python 3.11.</w:t>
+        <w:t xml:space="preserve">This simulation study is reported following the ADEMP framework (Aims, Data-generating mechanisms, Estimands, Methods, Performance measures) as recommended by Morris, White, and Crowther [25]. All analyses were conducted in Python 3.11.</w:t>
       </w:r>
     </w:p>
     <w:p>
@@ -2257,7 +2257,7 @@
         <w:t xml:space="preserve"> </w:t>
       </w:r>
       <w:r>
-        <w:t xml:space="preserve">A finite mixture model with K Gaussian components is fitted to the standardised covariate space X₁–X₁₀. Component assignments define strata. This represents the latent class analysis approach to hidden subgroup discovery [23].</w:t>
+        <w:t xml:space="preserve">A finite mixture model with K Gaussian components is fitted to the standardised covariate space X₁–X₁₀. Component assignments define strata. This represents the latent class analysis approach to hidden subgroup discovery [22].</w:t>
       </w:r>
     </w:p>
     <w:p>
@@ -2399,7 +2399,7 @@
         <w:t xml:space="preserve"> </w:t>
       </w:r>
       <w:r>
-        <w:t xml:space="preserve">[27]: Measures agreement between estimated strata and true Z-based clusters, corrected for chance. Range [−1, 1]; 1 = perfect agreement; 0 = chance level.</w:t>
+        <w:t xml:space="preserve">[26]: Measures agreement between estimated strata and true Z-based clusters, corrected for chance. Range [−1, 1]; 1 = perfect agreement; 0 = chance level.</w:t>
       </w:r>
     </w:p>
     <w:p>
@@ -2433,7 +2433,7 @@
         <w:t xml:space="preserve">Between-stratum heterogeneity indicator (C1)</w:t>
       </w:r>
       <w:r>
-        <w:t xml:space="preserve">: Defined as C1 = 1 − I², where I² is Higgins and Thompson’s [25] heterogeneity statistic applied to stratum-specific treatment effect estimates (log odds ratios of A→Y). Each stratum is treated as a</w:t>
+        <w:t xml:space="preserve">: Defined as C1 = 1 − I², where I² is Higgins and Thompson’s [24] heterogeneity statistic applied to stratum-specific treatment effect estimates (log odds ratios of A→Y). Each stratum is treated as a</w:t>
       </w:r>
       <w:r>
         <w:t xml:space="preserve"> </w:t>
@@ -2516,7 +2516,7 @@
         <w:t xml:space="preserve"> </w:t>
       </w:r>
       <w:r>
-        <w:t xml:space="preserve">[28]: An information-theoretic measure of cluster agreement. Range [0, 1].</w:t>
+        <w:t xml:space="preserve">[27]: An information-theoretic measure of cluster agreement. Range [0, 1].</w:t>
       </w:r>
     </w:p>
     <w:p>
@@ -9325,7 +9325,7 @@
         <w:t xml:space="preserve"> </w:t>
       </w:r>
       <w:r>
-        <w:t xml:space="preserve">population structure or effect modification. The hdPS algorithm [19] shares IONE’s insight that proxy variables may carry information about unmeasured confounders, but uses this information to improve propensity score estimation rather than to identify discrete subpopulations. Latent class analysis [23] seeks hidden subgroups but typically requires strong distributional assumptions and does not provide a coherence diagnostic.</w:t>
+        <w:t xml:space="preserve">population structure or effect modification. The hdPS algorithm [19] shares IONE’s insight that proxy variables may carry information about unmeasured confounders, but uses this information to improve propensity score estimation rather than to identify discrete subpopulations. Latent class analysis [22] seeks hidden subgroups but typically requires strong distributional assumptions and does not provide a coherence diagnostic.</w:t>
       </w:r>
     </w:p>
     <w:p>
@@ -10697,30 +10697,6 @@
       </w:r>
       <w:r>
         <w:t xml:space="preserve">. 2012;21(S1):41–9.</w:t>
-      </w:r>
-    </w:p>
-    <w:p>
-      <w:pPr>
-        <w:numPr>
-          <w:ilvl w:val="0"/>
-          <w:numId w:val="1011"/>
-        </w:numPr>
-        <w:pStyle w:val="Compact"/>
-      </w:pPr>
-      <w:r>
-        <w:t xml:space="preserve">Wyss R, Schneeweiss S, van der Laan M, Lendle SD, Ju C, Franklin JM. Using Super Learner prediction modeling to improve high-dimensional propensity score estimation.</w:t>
-      </w:r>
-      <w:r>
-        <w:t xml:space="preserve"> </w:t>
-      </w:r>
-      <w:r>
-        <w:rPr>
-          <w:i/>
-        </w:rPr>
-        <w:t xml:space="preserve">Epidemiology</w:t>
-      </w:r>
-      <w:r>
-        <w:t xml:space="preserve">. 2018;29(1):96–106.</w:t>
       </w:r>
     </w:p>
     <w:p>

</xml_diff>